<commit_message>
Update qualified-leads stat from 1,200+/month to 12,000+/month
Updated everywhere it appears: homepage stat card and GoodFlip case
study chip (index.html + work/goodflip.html), and all resume files
(main PDF, other files/Yash Gohel Brand Manager.pdf, both resume docx
files, and Yash_Portfolio_Content.docx). PDF edits were done via
redaction + font-matched re-insertion (same embedded font/size/color),
verified by rendering before/after crops.
</commit_message>
<xml_diff>
--- a/other files/Yash_Portfolio_Content.docx
+++ b/other files/Yash_Portfolio_Content.docx
@@ -592,7 +592,7 @@
         <w:rPr>
           <w:rStyle w:val="VerbatimChar"/>
         </w:rPr>
-        <w:t xml:space="preserve">1,200+ qualified leads / month</w:t>
+        <w:t xml:space="preserve">12,000+ qualified leads / month</w:t>
       </w:r>
       <w:r>
         <w:t xml:space="preserve"> </w:t>
@@ -1495,7 +1495,7 @@
         <w:rPr>
           <w:rStyle w:val="VerbatimChar"/>
         </w:rPr>
-        <w:t xml:space="preserve">1,200+</w:t>
+        <w:t xml:space="preserve">12,000+</w:t>
       </w:r>
       <w:r>
         <w:t xml:space="preserve"> </w:t>

</xml_diff>